<commit_message>
updated code after Unit Testing
</commit_message>
<xml_diff>
--- a/references/procurement-agent-run.docx
+++ b/references/procurement-agent-run.docx
@@ -3,9 +3,194 @@
 <w:document xmlns:wpc="http://schemas.microsoft.com/office/word/2010/wordprocessingCanvas" xmlns:cx="http://schemas.microsoft.com/office/drawing/2014/chartex" xmlns:cx1="http://schemas.microsoft.com/office/drawing/2015/9/8/chartex" xmlns:cx2="http://schemas.microsoft.com/office/drawing/2015/10/21/chartex" xmlns:cx3="http://schemas.microsoft.com/office/drawing/2016/5/9/chartex" xmlns:cx4="http://schemas.microsoft.com/office/drawing/2016/5/10/chartex" xmlns:cx5="http://schemas.microsoft.com/office/drawing/2016/5/11/chartex" xmlns:cx6="http://schemas.microsoft.com/office/drawing/2016/5/12/chartex" xmlns:cx7="http://schemas.microsoft.com/office/drawing/2016/5/13/chartex" xmlns:cx8="http://schemas.microsoft.com/office/drawing/2016/5/14/chartex" xmlns:mc="http://schemas.openxmlformats.org/markup-compatibility/2006" xmlns:aink="http://schemas.microsoft.com/office/drawing/2016/ink" xmlns:am3d="http://schemas.microsoft.com/office/drawing/2017/model3d" xmlns:o="urn:schemas-microsoft-com:office:office" xmlns:oel="http://schemas.microsoft.com/office/2019/extlst" xmlns:r="http://schemas.openxmlformats.org/officeDocument/2006/relationships" xmlns:m="http://schemas.openxmlformats.org/officeDocument/2006/math" xmlns:v="urn:schemas-microsoft-com:vml" xmlns:wp14="http://schemas.microsoft.com/office/word/2010/wordprocessingDrawing" xmlns:wp="http://schemas.openxmlformats.org/drawingml/2006/wordprocessingDrawing" xmlns:w10="urn:schemas-microsoft-com:office:word" xmlns:w="http://schemas.openxmlformats.org/wordprocessingml/2006/main" xmlns:w14="http://schemas.microsoft.com/office/word/2010/wordml" xmlns:w15="http://schemas.microsoft.com/office/word/2012/wordml" xmlns:w16cex="http://schemas.microsoft.com/office/word/2018/wordml/cex" xmlns:w16cid="http://schemas.microsoft.com/office/word/2016/wordml/cid" xmlns:w16="http://schemas.microsoft.com/office/word/2018/wordml" xmlns:w16du="http://schemas.microsoft.com/office/word/2023/wordml/word16du" xmlns:w16sdtdh="http://schemas.microsoft.com/office/word/2020/wordml/sdtdatahash" xmlns:w16sdtfl="http://schemas.microsoft.com/office/word/2024/wordml/sdtformatlock" xmlns:w16se="http://schemas.microsoft.com/office/word/2015/wordml/symex" xmlns:wpg="http://schemas.microsoft.com/office/word/2010/wordprocessingGroup" xmlns:wpi="http://schemas.microsoft.com/office/word/2010/wordprocessingInk" xmlns:wne="http://schemas.microsoft.com/office/word/2006/wordml" xmlns:wps="http://schemas.microsoft.com/office/word/2010/wordprocessingShape" mc:Ignorable="w14 w15 w16se w16cid w16 w16cex w16sdtdh w16sdtfl w16du wp14">
   <w:body>
     <w:p>
-      <w:r>
-        <w:t xml:space="preserve">    </w:t>
-      </w:r>
+      <w:pPr>
+        <w:pStyle w:val="ListParagraph"/>
+        <w:numPr>
+          <w:ilvl w:val="0"/>
+          <w:numId w:val="2"/>
+        </w:numPr>
+      </w:pPr>
+      <w:r>
+        <w:t xml:space="preserve">Create </w:t>
+      </w:r>
+      <w:proofErr w:type="spellStart"/>
+      <w:r>
+        <w:t>Groq</w:t>
+      </w:r>
+      <w:proofErr w:type="spellEnd"/>
+      <w:r>
+        <w:t xml:space="preserve"> API</w:t>
+      </w:r>
+    </w:p>
+    <w:p>
+      <w:pPr>
+        <w:pStyle w:val="ListParagraph"/>
+        <w:numPr>
+          <w:ilvl w:val="0"/>
+          <w:numId w:val="3"/>
+        </w:numPr>
+      </w:pPr>
+      <w:r>
+        <w:t>https://console.groq.com/keys</w:t>
+      </w:r>
+    </w:p>
+    <w:p>
+      <w:pPr>
+        <w:ind w:left="360" w:hanging="360"/>
+      </w:pPr>
+      <w:r>
+        <w:drawing>
+          <wp:inline distT="0" distB="0" distL="0" distR="0" wp14:anchorId="6DAEF1B4" wp14:editId="0263E2E9">
+            <wp:extent cx="4874895" cy="1885138"/>
+            <wp:effectExtent l="0" t="0" r="1905" b="1270"/>
+            <wp:docPr id="2046771103" name="Picture 1"/>
+            <wp:cNvGraphicFramePr>
+              <a:graphicFrameLocks xmlns:a="http://schemas.openxmlformats.org/drawingml/2006/main" noChangeAspect="1"/>
+            </wp:cNvGraphicFramePr>
+            <a:graphic xmlns:a="http://schemas.openxmlformats.org/drawingml/2006/main">
+              <a:graphicData uri="http://schemas.openxmlformats.org/drawingml/2006/picture">
+                <pic:pic xmlns:pic="http://schemas.openxmlformats.org/drawingml/2006/picture">
+                  <pic:nvPicPr>
+                    <pic:cNvPr id="2046771103" name=""/>
+                    <pic:cNvPicPr/>
+                  </pic:nvPicPr>
+                  <pic:blipFill>
+                    <a:blip r:embed="rId7"/>
+                    <a:stretch>
+                      <a:fillRect/>
+                    </a:stretch>
+                  </pic:blipFill>
+                  <pic:spPr>
+                    <a:xfrm>
+                      <a:off x="0" y="0"/>
+                      <a:ext cx="4884458" cy="1888836"/>
+                    </a:xfrm>
+                    <a:prstGeom prst="rect">
+                      <a:avLst/>
+                    </a:prstGeom>
+                  </pic:spPr>
+                </pic:pic>
+              </a:graphicData>
+            </a:graphic>
+          </wp:inline>
+        </w:drawing>
+      </w:r>
+    </w:p>
+    <w:p>
+      <w:pPr>
+        <w:ind w:left="360" w:hanging="360"/>
+      </w:pPr>
+      <w:r>
+        <w:drawing>
+          <wp:inline distT="0" distB="0" distL="0" distR="0" wp14:anchorId="232FB74A" wp14:editId="7897540B">
+            <wp:extent cx="4905691" cy="1723805"/>
+            <wp:effectExtent l="0" t="0" r="0" b="0"/>
+            <wp:docPr id="240701092" name="Picture 1"/>
+            <wp:cNvGraphicFramePr>
+              <a:graphicFrameLocks xmlns:a="http://schemas.openxmlformats.org/drawingml/2006/main" noChangeAspect="1"/>
+            </wp:cNvGraphicFramePr>
+            <a:graphic xmlns:a="http://schemas.openxmlformats.org/drawingml/2006/main">
+              <a:graphicData uri="http://schemas.openxmlformats.org/drawingml/2006/picture">
+                <pic:pic xmlns:pic="http://schemas.openxmlformats.org/drawingml/2006/picture">
+                  <pic:nvPicPr>
+                    <pic:cNvPr id="240701092" name=""/>
+                    <pic:cNvPicPr/>
+                  </pic:nvPicPr>
+                  <pic:blipFill>
+                    <a:blip r:embed="rId8"/>
+                    <a:stretch>
+                      <a:fillRect/>
+                    </a:stretch>
+                  </pic:blipFill>
+                  <pic:spPr>
+                    <a:xfrm>
+                      <a:off x="0" y="0"/>
+                      <a:ext cx="4916055" cy="1727447"/>
+                    </a:xfrm>
+                    <a:prstGeom prst="rect">
+                      <a:avLst/>
+                    </a:prstGeom>
+                  </pic:spPr>
+                </pic:pic>
+              </a:graphicData>
+            </a:graphic>
+          </wp:inline>
+        </w:drawing>
+      </w:r>
+    </w:p>
+    <w:p>
+      <w:pPr>
+        <w:pStyle w:val="ListParagraph"/>
+        <w:numPr>
+          <w:ilvl w:val="0"/>
+          <w:numId w:val="2"/>
+        </w:numPr>
+      </w:pPr>
+      <w:r>
+        <w:t xml:space="preserve">Save </w:t>
+      </w:r>
+      <w:proofErr w:type="spellStart"/>
+      <w:r>
+        <w:t>Groq</w:t>
+      </w:r>
+      <w:proofErr w:type="spellEnd"/>
+      <w:r>
+        <w:t xml:space="preserve"> API</w:t>
+      </w:r>
+      <w:r>
+        <w:t xml:space="preserve"> Key</w:t>
+      </w:r>
+    </w:p>
+    <w:p>
+      <w:pPr>
+        <w:pStyle w:val="ListParagraph"/>
+        <w:numPr>
+          <w:ilvl w:val="0"/>
+          <w:numId w:val="1"/>
+        </w:numPr>
+      </w:pPr>
+      <w:r>
+        <w:t>procurement-agent</w:t>
+      </w:r>
+    </w:p>
+    <w:p>
+      <w:pPr>
+        <w:pStyle w:val="ListParagraph"/>
+        <w:numPr>
+          <w:ilvl w:val="0"/>
+          <w:numId w:val="1"/>
+        </w:numPr>
+      </w:pPr>
+      <w:r>
+        <w:t>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</w:t>
+      </w:r>
+    </w:p>
+    <w:p>
+      <w:pPr>
+        <w:pStyle w:val="ListParagraph"/>
+        <w:ind w:left="360"/>
+      </w:pPr>
+    </w:p>
+    <w:p>
+      <w:pPr>
+        <w:pStyle w:val="ListParagraph"/>
+        <w:numPr>
+          <w:ilvl w:val="0"/>
+          <w:numId w:val="2"/>
+        </w:numPr>
+      </w:pPr>
+      <w:r>
+        <w:t>Create and activate a virtual environment:</w:t>
+      </w:r>
+    </w:p>
+    <w:p>
+      <w:pPr>
+        <w:pStyle w:val="ListParagraph"/>
+        <w:numPr>
+          <w:ilvl w:val="0"/>
+          <w:numId w:val="1"/>
+        </w:numPr>
+      </w:pPr>
       <w:proofErr w:type="spellStart"/>
       <w:r>
         <w:t>py</w:t>
@@ -31,8 +216,15 @@
       <w:proofErr w:type="gramEnd"/>
     </w:p>
     <w:p>
-      <w:r>
-        <w:t>    .\.</w:t>
+      <w:pPr>
+        <w:pStyle w:val="ListParagraph"/>
+        <w:numPr>
+          <w:ilvl w:val="0"/>
+          <w:numId w:val="1"/>
+        </w:numPr>
+      </w:pPr>
+      <w:r>
+        <w:t>.\.</w:t>
       </w:r>
       <w:proofErr w:type="spellStart"/>
       <w:r>
@@ -44,29 +236,41 @@
       </w:r>
     </w:p>
     <w:p>
-      <w:r>
-        <w:t>    python -m pip install --upgrade pip</w:t>
-      </w:r>
-    </w:p>
-    <w:p>
-      <w:r>
-        <w:t xml:space="preserve">    pip install -r </w:t>
-      </w:r>
-      <w:proofErr w:type="spellStart"/>
-      <w:proofErr w:type="gramStart"/>
-      <w:r>
-        <w:t>requirements.tx</w:t>
-      </w:r>
-      <w:proofErr w:type="spellEnd"/>
-      <w:proofErr w:type="gramEnd"/>
-    </w:p>
-    <w:p/>
-    <w:p>
-      <w:r>
+      <w:pPr>
+        <w:pStyle w:val="ListParagraph"/>
+        <w:numPr>
+          <w:ilvl w:val="0"/>
+          <w:numId w:val="1"/>
+        </w:numPr>
+      </w:pPr>
+      <w:r>
+        <w:t>python -m pip install --upgrade pip</w:t>
+      </w:r>
+    </w:p>
+    <w:p>
+      <w:pPr>
+        <w:pStyle w:val="ListParagraph"/>
+        <w:numPr>
+          <w:ilvl w:val="0"/>
+          <w:numId w:val="1"/>
+        </w:numPr>
+      </w:pPr>
+      <w:r>
+        <w:t>pip install -r requirements.tx</w:t>
+      </w:r>
+      <w:r>
+        <w:t>t</w:t>
+      </w:r>
+    </w:p>
+    <w:p>
+      <w:r>
+        <w:rPr>
+          <w:noProof/>
+        </w:rPr>
         <w:drawing>
-          <wp:inline distT="0" distB="0" distL="0" distR="0" wp14:anchorId="0D4DD5DA" wp14:editId="4085CDC2">
-            <wp:extent cx="5943600" cy="1610360"/>
-            <wp:effectExtent l="0" t="0" r="0" b="8890"/>
+          <wp:inline distT="0" distB="0" distL="0" distR="0" wp14:anchorId="0D4DD5DA" wp14:editId="1BACB95E">
+            <wp:extent cx="5943600" cy="1404103"/>
+            <wp:effectExtent l="0" t="0" r="0" b="5715"/>
             <wp:docPr id="1878756493" name="Picture 1"/>
             <wp:cNvGraphicFramePr>
               <a:graphicFrameLocks xmlns:a="http://schemas.openxmlformats.org/drawingml/2006/main" noChangeAspect="1"/>
@@ -79,7 +283,7 @@
                     <pic:cNvPicPr/>
                   </pic:nvPicPr>
                   <pic:blipFill>
-                    <a:blip r:embed="rId4"/>
+                    <a:blip r:embed="rId9"/>
                     <a:stretch>
                       <a:fillRect/>
                     </a:stretch>
@@ -87,7 +291,7 @@
                   <pic:spPr>
                     <a:xfrm>
                       <a:off x="0" y="0"/>
-                      <a:ext cx="5943600" cy="1610360"/>
+                      <a:ext cx="5947414" cy="1405004"/>
                     </a:xfrm>
                     <a:prstGeom prst="rect">
                       <a:avLst/>
@@ -100,10 +304,43 @@
         </w:drawing>
       </w:r>
     </w:p>
-    <w:p/>
-    <w:p>
-      <w:r>
-        <w:t>    Copy-</w:t>
+    <w:p>
+      <w:pPr>
+        <w:pStyle w:val="ListParagraph"/>
+        <w:numPr>
+          <w:ilvl w:val="0"/>
+          <w:numId w:val="2"/>
+        </w:numPr>
+      </w:pPr>
+      <w:r>
+        <w:lastRenderedPageBreak/>
+        <w:t>C</w:t>
+      </w:r>
+      <w:r>
+        <w:t xml:space="preserve">reate the environment file and update the local </w:t>
+      </w:r>
+      <w:proofErr w:type="spellStart"/>
+      <w:r>
+        <w:t>ChromaDB</w:t>
+      </w:r>
+      <w:proofErr w:type="spellEnd"/>
+      <w:r>
+        <w:t xml:space="preserve"> settings:</w:t>
+      </w:r>
+    </w:p>
+    <w:p>
+      <w:pPr>
+        <w:pStyle w:val="ListParagraph"/>
+        <w:numPr>
+          <w:ilvl w:val="0"/>
+          <w:numId w:val="1"/>
+        </w:numPr>
+      </w:pPr>
+      <w:r>
+        <w:t>c</w:t>
+      </w:r>
+      <w:r>
+        <w:t>opy-</w:t>
       </w:r>
       <w:proofErr w:type="gramStart"/>
       <w:r>
@@ -129,6 +366,9 @@
     </w:p>
     <w:p>
       <w:r>
+        <w:rPr>
+          <w:noProof/>
+        </w:rPr>
         <w:drawing>
           <wp:inline distT="0" distB="0" distL="0" distR="0" wp14:anchorId="6CCF5310" wp14:editId="622B14A3">
             <wp:extent cx="5943600" cy="354330"/>
@@ -145,7 +385,7 @@
                     <pic:cNvPicPr/>
                   </pic:nvPicPr>
                   <pic:blipFill>
-                    <a:blip r:embed="rId5"/>
+                    <a:blip r:embed="rId10"/>
                     <a:stretch>
                       <a:fillRect/>
                     </a:stretch>
@@ -166,13 +406,53 @@
         </w:drawing>
       </w:r>
     </w:p>
-    <w:p/>
-    <w:p>
-      <w:r>
-        <w:t>    .\.</w:t>
+    <w:p>
+      <w:pPr>
+        <w:pStyle w:val="ListParagraph"/>
+        <w:numPr>
+          <w:ilvl w:val="0"/>
+          <w:numId w:val="2"/>
+        </w:numPr>
+      </w:pPr>
+      <w:r>
+        <w:t xml:space="preserve">Start </w:t>
       </w:r>
       <w:proofErr w:type="spellStart"/>
       <w:r>
+        <w:t>ChromaDB</w:t>
+      </w:r>
+      <w:proofErr w:type="spellEnd"/>
+      <w:r>
+        <w:t xml:space="preserve"> in terminal 1. The `--path` directory stores vectors locally and is created automatically:</w:t>
+      </w:r>
+    </w:p>
+    <w:p>
+      <w:pPr>
+        <w:pStyle w:val="ListParagraph"/>
+        <w:numPr>
+          <w:ilvl w:val="0"/>
+          <w:numId w:val="1"/>
+        </w:numPr>
+      </w:pPr>
+      <w:proofErr w:type="gramStart"/>
+      <w:r>
+        <w:t>cd  C:\BASAK\Codebase\github_repos\edureka_capstone_b12_jkbasak</w:t>
+      </w:r>
+      <w:proofErr w:type="gramEnd"/>
+    </w:p>
+    <w:p>
+      <w:pPr>
+        <w:pStyle w:val="ListParagraph"/>
+        <w:numPr>
+          <w:ilvl w:val="0"/>
+          <w:numId w:val="1"/>
+        </w:numPr>
+      </w:pPr>
+      <w:r>
+        <w:t>.\.</w:t>
+      </w:r>
+      <w:proofErr w:type="spellStart"/>
+      <w:r>
         <w:t>venv</w:t>
       </w:r>
       <w:proofErr w:type="spellEnd"/>
@@ -181,8 +461,15 @@
       </w:r>
     </w:p>
     <w:p>
-      <w:r>
-        <w:t>    chroma run --</w:t>
+      <w:pPr>
+        <w:pStyle w:val="ListParagraph"/>
+        <w:numPr>
+          <w:ilvl w:val="0"/>
+          <w:numId w:val="1"/>
+        </w:numPr>
+      </w:pPr>
+      <w:r>
+        <w:t>chroma run --</w:t>
       </w:r>
       <w:proofErr w:type="gramStart"/>
       <w:r>
@@ -201,17 +488,13 @@
         <w:t xml:space="preserve"> --host localhost --port 8001</w:t>
       </w:r>
     </w:p>
-    <w:p/>
-    <w:p/>
-    <w:p/>
-    <w:p>
-      <w:r>
-        <w:lastRenderedPageBreak/>
+    <w:p>
+      <w:r>
         <w:drawing>
-          <wp:inline distT="0" distB="0" distL="0" distR="0" wp14:anchorId="25F120E6" wp14:editId="44C29F35">
-            <wp:extent cx="5943600" cy="2755265"/>
-            <wp:effectExtent l="0" t="0" r="0" b="6985"/>
-            <wp:docPr id="1375223680" name="Picture 1"/>
+          <wp:inline distT="0" distB="0" distL="0" distR="0" wp14:anchorId="6E61933D" wp14:editId="3A5D1307">
+            <wp:extent cx="5943600" cy="2062817"/>
+            <wp:effectExtent l="0" t="0" r="0" b="0"/>
+            <wp:docPr id="889613067" name="Picture 1"/>
             <wp:cNvGraphicFramePr>
               <a:graphicFrameLocks xmlns:a="http://schemas.openxmlformats.org/drawingml/2006/main" noChangeAspect="1"/>
             </wp:cNvGraphicFramePr>
@@ -219,11 +502,11 @@
               <a:graphicData uri="http://schemas.openxmlformats.org/drawingml/2006/picture">
                 <pic:pic xmlns:pic="http://schemas.openxmlformats.org/drawingml/2006/picture">
                   <pic:nvPicPr>
-                    <pic:cNvPr id="1375223680" name=""/>
+                    <pic:cNvPr id="889613067" name=""/>
                     <pic:cNvPicPr/>
                   </pic:nvPicPr>
                   <pic:blipFill>
-                    <a:blip r:embed="rId6"/>
+                    <a:blip r:embed="rId11"/>
                     <a:stretch>
                       <a:fillRect/>
                     </a:stretch>
@@ -231,7 +514,7 @@
                   <pic:spPr>
                     <a:xfrm>
                       <a:off x="0" y="0"/>
-                      <a:ext cx="5943600" cy="2755265"/>
+                      <a:ext cx="5946113" cy="2063689"/>
                     </a:xfrm>
                     <a:prstGeom prst="rect">
                       <a:avLst/>
@@ -245,11 +528,52 @@
       </w:r>
     </w:p>
     <w:p>
-      <w:r>
-        <w:t>    .\.</w:t>
+      <w:pPr>
+        <w:pStyle w:val="ListParagraph"/>
+        <w:numPr>
+          <w:ilvl w:val="0"/>
+          <w:numId w:val="2"/>
+        </w:numPr>
+      </w:pPr>
+      <w:r>
+        <w:t xml:space="preserve">Start the </w:t>
       </w:r>
       <w:proofErr w:type="spellStart"/>
       <w:r>
+        <w:t>FastAPI</w:t>
+      </w:r>
+      <w:proofErr w:type="spellEnd"/>
+      <w:r>
+        <w:t xml:space="preserve"> backend in terminal 2:</w:t>
+      </w:r>
+    </w:p>
+    <w:p>
+      <w:pPr>
+        <w:pStyle w:val="ListParagraph"/>
+        <w:numPr>
+          <w:ilvl w:val="0"/>
+          <w:numId w:val="1"/>
+        </w:numPr>
+      </w:pPr>
+      <w:proofErr w:type="gramStart"/>
+      <w:r>
+        <w:t>cd  C:\BASAK\Codebase\github_repos\edureka_capstone_b12_jkbasak</w:t>
+      </w:r>
+      <w:proofErr w:type="gramEnd"/>
+    </w:p>
+    <w:p>
+      <w:pPr>
+        <w:pStyle w:val="ListParagraph"/>
+        <w:numPr>
+          <w:ilvl w:val="0"/>
+          <w:numId w:val="1"/>
+        </w:numPr>
+      </w:pPr>
+      <w:r>
+        <w:t>.\.</w:t>
+      </w:r>
+      <w:proofErr w:type="spellStart"/>
+      <w:r>
         <w:t>venv</w:t>
       </w:r>
       <w:proofErr w:type="spellEnd"/>
@@ -258,9 +582,13 @@
       </w:r>
     </w:p>
     <w:p>
-      <w:r>
-        <w:t xml:space="preserve">    </w:t>
-      </w:r>
+      <w:pPr>
+        <w:pStyle w:val="ListParagraph"/>
+        <w:numPr>
+          <w:ilvl w:val="0"/>
+          <w:numId w:val="1"/>
+        </w:numPr>
+      </w:pPr>
       <w:proofErr w:type="spellStart"/>
       <w:r>
         <w:t>uvicorn</w:t>
@@ -283,14 +611,13 @@
         <w:t xml:space="preserve"> --reload --host 127.0.0.1 --port 8000</w:t>
       </w:r>
     </w:p>
-    <w:p/>
     <w:p>
       <w:r>
         <w:drawing>
-          <wp:inline distT="0" distB="0" distL="0" distR="0" wp14:anchorId="3FA49FCC" wp14:editId="2AA2A326">
-            <wp:extent cx="5943600" cy="2356485"/>
-            <wp:effectExtent l="0" t="0" r="0" b="5715"/>
-            <wp:docPr id="1011455667" name="Picture 1"/>
+          <wp:inline distT="0" distB="0" distL="0" distR="0" wp14:anchorId="392CFCAF" wp14:editId="0045F5D9">
+            <wp:extent cx="5943600" cy="1407795"/>
+            <wp:effectExtent l="0" t="0" r="0" b="1905"/>
+            <wp:docPr id="2051694099" name="Picture 1"/>
             <wp:cNvGraphicFramePr>
               <a:graphicFrameLocks xmlns:a="http://schemas.openxmlformats.org/drawingml/2006/main" noChangeAspect="1"/>
             </wp:cNvGraphicFramePr>
@@ -298,11 +625,11 @@
               <a:graphicData uri="http://schemas.openxmlformats.org/drawingml/2006/picture">
                 <pic:pic xmlns:pic="http://schemas.openxmlformats.org/drawingml/2006/picture">
                   <pic:nvPicPr>
-                    <pic:cNvPr id="1011455667" name=""/>
+                    <pic:cNvPr id="2051694099" name=""/>
                     <pic:cNvPicPr/>
                   </pic:nvPicPr>
                   <pic:blipFill>
-                    <a:blip r:embed="rId7"/>
+                    <a:blip r:embed="rId12"/>
                     <a:stretch>
                       <a:fillRect/>
                     </a:stretch>
@@ -310,7 +637,7 @@
                   <pic:spPr>
                     <a:xfrm>
                       <a:off x="0" y="0"/>
-                      <a:ext cx="5943600" cy="2356485"/>
+                      <a:ext cx="5943600" cy="1407795"/>
                     </a:xfrm>
                     <a:prstGeom prst="rect">
                       <a:avLst/>
@@ -323,12 +650,60 @@
         </w:drawing>
       </w:r>
     </w:p>
-    <w:p>
-      <w:r>
-        <w:t>    .\.</w:t>
+    <w:p/>
+    <w:p>
+      <w:r>
+        <w:br w:type="page"/>
+      </w:r>
+    </w:p>
+    <w:p>
+      <w:pPr>
+        <w:pStyle w:val="ListParagraph"/>
+        <w:numPr>
+          <w:ilvl w:val="0"/>
+          <w:numId w:val="2"/>
+        </w:numPr>
+      </w:pPr>
+      <w:r>
+        <w:lastRenderedPageBreak/>
+        <w:t xml:space="preserve">Start the </w:t>
       </w:r>
       <w:proofErr w:type="spellStart"/>
       <w:r>
+        <w:t>Streamlit</w:t>
+      </w:r>
+      <w:proofErr w:type="spellEnd"/>
+      <w:r>
+        <w:t xml:space="preserve"> UI in terminal 3:</w:t>
+      </w:r>
+    </w:p>
+    <w:p>
+      <w:pPr>
+        <w:pStyle w:val="ListParagraph"/>
+        <w:numPr>
+          <w:ilvl w:val="0"/>
+          <w:numId w:val="1"/>
+        </w:numPr>
+      </w:pPr>
+      <w:proofErr w:type="gramStart"/>
+      <w:r>
+        <w:t>cd  C:\BASAK\Codebase\github_repos\edureka_capstone_b12_jkbasak</w:t>
+      </w:r>
+      <w:proofErr w:type="gramEnd"/>
+    </w:p>
+    <w:p>
+      <w:pPr>
+        <w:pStyle w:val="ListParagraph"/>
+        <w:numPr>
+          <w:ilvl w:val="0"/>
+          <w:numId w:val="1"/>
+        </w:numPr>
+      </w:pPr>
+      <w:r>
+        <w:t>.\.</w:t>
+      </w:r>
+      <w:proofErr w:type="spellStart"/>
+      <w:r>
         <w:t>venv</w:t>
       </w:r>
       <w:proofErr w:type="spellEnd"/>
@@ -337,9 +712,13 @@
       </w:r>
     </w:p>
     <w:p>
-      <w:r>
-        <w:t xml:space="preserve">    </w:t>
-      </w:r>
+      <w:pPr>
+        <w:pStyle w:val="ListParagraph"/>
+        <w:numPr>
+          <w:ilvl w:val="0"/>
+          <w:numId w:val="1"/>
+        </w:numPr>
+      </w:pPr>
       <w:proofErr w:type="spellStart"/>
       <w:r>
         <w:t>streamlit</w:t>
@@ -359,15 +738,13 @@
         <w:t xml:space="preserve"> 8501</w:t>
       </w:r>
     </w:p>
-    <w:p/>
-    <w:p>
-      <w:r>
-        <w:lastRenderedPageBreak/>
+    <w:p>
+      <w:r>
         <w:drawing>
-          <wp:inline distT="0" distB="0" distL="0" distR="0" wp14:anchorId="580DA2D8" wp14:editId="15EA90CC">
-            <wp:extent cx="5943600" cy="1950720"/>
+          <wp:inline distT="0" distB="0" distL="0" distR="0" wp14:anchorId="6BD115A2" wp14:editId="0F52474C">
+            <wp:extent cx="5943600" cy="1543685"/>
             <wp:effectExtent l="0" t="0" r="0" b="0"/>
-            <wp:docPr id="1563450875" name="Picture 1"/>
+            <wp:docPr id="637324948" name="Picture 1"/>
             <wp:cNvGraphicFramePr>
               <a:graphicFrameLocks xmlns:a="http://schemas.openxmlformats.org/drawingml/2006/main" noChangeAspect="1"/>
             </wp:cNvGraphicFramePr>
@@ -375,11 +752,11 @@
               <a:graphicData uri="http://schemas.openxmlformats.org/drawingml/2006/picture">
                 <pic:pic xmlns:pic="http://schemas.openxmlformats.org/drawingml/2006/picture">
                   <pic:nvPicPr>
-                    <pic:cNvPr id="1563450875" name=""/>
+                    <pic:cNvPr id="637324948" name=""/>
                     <pic:cNvPicPr/>
                   </pic:nvPicPr>
                   <pic:blipFill>
-                    <a:blip r:embed="rId8"/>
+                    <a:blip r:embed="rId13"/>
                     <a:stretch>
                       <a:fillRect/>
                     </a:stretch>
@@ -387,7 +764,7 @@
                   <pic:spPr>
                     <a:xfrm>
                       <a:off x="0" y="0"/>
-                      <a:ext cx="5943600" cy="1950720"/>
+                      <a:ext cx="5943600" cy="1543685"/>
                     </a:xfrm>
                     <a:prstGeom prst="rect">
                       <a:avLst/>
@@ -400,8 +777,14 @@
         </w:drawing>
       </w:r>
     </w:p>
-    <w:p/>
-    <w:p>
+    <w:p>
+      <w:pPr>
+        <w:pStyle w:val="ListParagraph"/>
+        <w:numPr>
+          <w:ilvl w:val="0"/>
+          <w:numId w:val="2"/>
+        </w:numPr>
+      </w:pPr>
       <w:r>
         <w:t>Open the UI at `http://localhost:8501</w:t>
       </w:r>
@@ -409,10 +792,10 @@
     <w:p>
       <w:r>
         <w:drawing>
-          <wp:inline distT="0" distB="0" distL="0" distR="0" wp14:anchorId="064C27A5" wp14:editId="62663003">
-            <wp:extent cx="5943600" cy="2329180"/>
-            <wp:effectExtent l="0" t="0" r="0" b="0"/>
-            <wp:docPr id="1244305688" name="Picture 1"/>
+          <wp:inline distT="0" distB="0" distL="0" distR="0" wp14:anchorId="085658C1" wp14:editId="3EE533FC">
+            <wp:extent cx="5876428" cy="2128514"/>
+            <wp:effectExtent l="0" t="0" r="0" b="5715"/>
+            <wp:docPr id="1009814705" name="Picture 1"/>
             <wp:cNvGraphicFramePr>
               <a:graphicFrameLocks xmlns:a="http://schemas.openxmlformats.org/drawingml/2006/main" noChangeAspect="1"/>
             </wp:cNvGraphicFramePr>
@@ -420,11 +803,11 @@
               <a:graphicData uri="http://schemas.openxmlformats.org/drawingml/2006/picture">
                 <pic:pic xmlns:pic="http://schemas.openxmlformats.org/drawingml/2006/picture">
                   <pic:nvPicPr>
-                    <pic:cNvPr id="1244305688" name=""/>
+                    <pic:cNvPr id="1009814705" name=""/>
                     <pic:cNvPicPr/>
                   </pic:nvPicPr>
                   <pic:blipFill>
-                    <a:blip r:embed="rId9"/>
+                    <a:blip r:embed="rId14"/>
                     <a:stretch>
                       <a:fillRect/>
                     </a:stretch>
@@ -432,7 +815,7 @@
                   <pic:spPr>
                     <a:xfrm>
                       <a:off x="0" y="0"/>
-                      <a:ext cx="5943600" cy="2329180"/>
+                      <a:ext cx="5904895" cy="2138825"/>
                     </a:xfrm>
                     <a:prstGeom prst="rect">
                       <a:avLst/>
@@ -445,14 +828,13 @@
         </w:drawing>
       </w:r>
     </w:p>
-    <w:p/>
     <w:p>
       <w:r>
         <w:drawing>
-          <wp:inline distT="0" distB="0" distL="0" distR="0" wp14:anchorId="2AA5CF85" wp14:editId="296EBAA7">
-            <wp:extent cx="5943600" cy="1948815"/>
-            <wp:effectExtent l="0" t="0" r="0" b="0"/>
-            <wp:docPr id="1050832603" name="Picture 1"/>
+          <wp:inline distT="0" distB="0" distL="0" distR="0" wp14:anchorId="661EA4C1" wp14:editId="6EE9753E">
+            <wp:extent cx="5943600" cy="2152015"/>
+            <wp:effectExtent l="0" t="0" r="0" b="635"/>
+            <wp:docPr id="1629738686" name="Picture 1"/>
             <wp:cNvGraphicFramePr>
               <a:graphicFrameLocks xmlns:a="http://schemas.openxmlformats.org/drawingml/2006/main" noChangeAspect="1"/>
             </wp:cNvGraphicFramePr>
@@ -460,11 +842,11 @@
               <a:graphicData uri="http://schemas.openxmlformats.org/drawingml/2006/picture">
                 <pic:pic xmlns:pic="http://schemas.openxmlformats.org/drawingml/2006/picture">
                   <pic:nvPicPr>
-                    <pic:cNvPr id="1050832603" name=""/>
+                    <pic:cNvPr id="1629738686" name=""/>
                     <pic:cNvPicPr/>
                   </pic:nvPicPr>
                   <pic:blipFill>
-                    <a:blip r:embed="rId10"/>
+                    <a:blip r:embed="rId15"/>
                     <a:stretch>
                       <a:fillRect/>
                     </a:stretch>
@@ -472,7 +854,7 @@
                   <pic:spPr>
                     <a:xfrm>
                       <a:off x="0" y="0"/>
-                      <a:ext cx="5943600" cy="1948815"/>
+                      <a:ext cx="5943600" cy="2152015"/>
                     </a:xfrm>
                     <a:prstGeom prst="rect">
                       <a:avLst/>
@@ -485,7 +867,209 @@
         </w:drawing>
       </w:r>
     </w:p>
+    <w:p>
+      <w:r>
+        <w:lastRenderedPageBreak/>
+        <w:drawing>
+          <wp:inline distT="0" distB="0" distL="0" distR="0" wp14:anchorId="7AEAEE4F" wp14:editId="35DCB06D">
+            <wp:extent cx="5943600" cy="2207260"/>
+            <wp:effectExtent l="0" t="0" r="0" b="2540"/>
+            <wp:docPr id="287751746" name="Picture 1"/>
+            <wp:cNvGraphicFramePr>
+              <a:graphicFrameLocks xmlns:a="http://schemas.openxmlformats.org/drawingml/2006/main" noChangeAspect="1"/>
+            </wp:cNvGraphicFramePr>
+            <a:graphic xmlns:a="http://schemas.openxmlformats.org/drawingml/2006/main">
+              <a:graphicData uri="http://schemas.openxmlformats.org/drawingml/2006/picture">
+                <pic:pic xmlns:pic="http://schemas.openxmlformats.org/drawingml/2006/picture">
+                  <pic:nvPicPr>
+                    <pic:cNvPr id="287751746" name=""/>
+                    <pic:cNvPicPr/>
+                  </pic:nvPicPr>
+                  <pic:blipFill>
+                    <a:blip r:embed="rId16"/>
+                    <a:stretch>
+                      <a:fillRect/>
+                    </a:stretch>
+                  </pic:blipFill>
+                  <pic:spPr>
+                    <a:xfrm>
+                      <a:off x="0" y="0"/>
+                      <a:ext cx="5943600" cy="2207260"/>
+                    </a:xfrm>
+                    <a:prstGeom prst="rect">
+                      <a:avLst/>
+                    </a:prstGeom>
+                  </pic:spPr>
+                </pic:pic>
+              </a:graphicData>
+            </a:graphic>
+          </wp:inline>
+        </w:drawing>
+      </w:r>
+    </w:p>
+    <w:p>
+      <w:r>
+        <w:drawing>
+          <wp:inline distT="0" distB="0" distL="0" distR="0" wp14:anchorId="5865DBD1" wp14:editId="7627DE88">
+            <wp:extent cx="5943600" cy="2224405"/>
+            <wp:effectExtent l="0" t="0" r="0" b="4445"/>
+            <wp:docPr id="1741810329" name="Picture 1"/>
+            <wp:cNvGraphicFramePr>
+              <a:graphicFrameLocks xmlns:a="http://schemas.openxmlformats.org/drawingml/2006/main" noChangeAspect="1"/>
+            </wp:cNvGraphicFramePr>
+            <a:graphic xmlns:a="http://schemas.openxmlformats.org/drawingml/2006/main">
+              <a:graphicData uri="http://schemas.openxmlformats.org/drawingml/2006/picture">
+                <pic:pic xmlns:pic="http://schemas.openxmlformats.org/drawingml/2006/picture">
+                  <pic:nvPicPr>
+                    <pic:cNvPr id="1741810329" name=""/>
+                    <pic:cNvPicPr/>
+                  </pic:nvPicPr>
+                  <pic:blipFill>
+                    <a:blip r:embed="rId17"/>
+                    <a:stretch>
+                      <a:fillRect/>
+                    </a:stretch>
+                  </pic:blipFill>
+                  <pic:spPr>
+                    <a:xfrm>
+                      <a:off x="0" y="0"/>
+                      <a:ext cx="5943600" cy="2224405"/>
+                    </a:xfrm>
+                    <a:prstGeom prst="rect">
+                      <a:avLst/>
+                    </a:prstGeom>
+                  </pic:spPr>
+                </pic:pic>
+              </a:graphicData>
+            </a:graphic>
+          </wp:inline>
+        </w:drawing>
+      </w:r>
+    </w:p>
+    <w:p>
+      <w:r>
+        <w:drawing>
+          <wp:inline distT="0" distB="0" distL="0" distR="0" wp14:anchorId="045174A1" wp14:editId="6687CE28">
+            <wp:extent cx="5943600" cy="3042920"/>
+            <wp:effectExtent l="0" t="0" r="0" b="5080"/>
+            <wp:docPr id="913331810" name="Picture 1"/>
+            <wp:cNvGraphicFramePr>
+              <a:graphicFrameLocks xmlns:a="http://schemas.openxmlformats.org/drawingml/2006/main" noChangeAspect="1"/>
+            </wp:cNvGraphicFramePr>
+            <a:graphic xmlns:a="http://schemas.openxmlformats.org/drawingml/2006/main">
+              <a:graphicData uri="http://schemas.openxmlformats.org/drawingml/2006/picture">
+                <pic:pic xmlns:pic="http://schemas.openxmlformats.org/drawingml/2006/picture">
+                  <pic:nvPicPr>
+                    <pic:cNvPr id="913331810" name=""/>
+                    <pic:cNvPicPr/>
+                  </pic:nvPicPr>
+                  <pic:blipFill>
+                    <a:blip r:embed="rId18"/>
+                    <a:stretch>
+                      <a:fillRect/>
+                    </a:stretch>
+                  </pic:blipFill>
+                  <pic:spPr>
+                    <a:xfrm>
+                      <a:off x="0" y="0"/>
+                      <a:ext cx="5943600" cy="3042920"/>
+                    </a:xfrm>
+                    <a:prstGeom prst="rect">
+                      <a:avLst/>
+                    </a:prstGeom>
+                  </pic:spPr>
+                </pic:pic>
+              </a:graphicData>
+            </a:graphic>
+          </wp:inline>
+        </w:drawing>
+      </w:r>
+    </w:p>
+    <w:p/>
+    <w:p>
+      <w:r>
+        <w:lastRenderedPageBreak/>
+        <w:drawing>
+          <wp:inline distT="0" distB="0" distL="0" distR="0" wp14:anchorId="75096A44" wp14:editId="6B2BADE3">
+            <wp:extent cx="6083935" cy="3306574"/>
+            <wp:effectExtent l="0" t="0" r="0" b="8255"/>
+            <wp:docPr id="175526948" name="Picture 1"/>
+            <wp:cNvGraphicFramePr>
+              <a:graphicFrameLocks xmlns:a="http://schemas.openxmlformats.org/drawingml/2006/main" noChangeAspect="1"/>
+            </wp:cNvGraphicFramePr>
+            <a:graphic xmlns:a="http://schemas.openxmlformats.org/drawingml/2006/main">
+              <a:graphicData uri="http://schemas.openxmlformats.org/drawingml/2006/picture">
+                <pic:pic xmlns:pic="http://schemas.openxmlformats.org/drawingml/2006/picture">
+                  <pic:nvPicPr>
+                    <pic:cNvPr id="175526948" name=""/>
+                    <pic:cNvPicPr/>
+                  </pic:nvPicPr>
+                  <pic:blipFill>
+                    <a:blip r:embed="rId19"/>
+                    <a:stretch>
+                      <a:fillRect/>
+                    </a:stretch>
+                  </pic:blipFill>
+                  <pic:spPr>
+                    <a:xfrm>
+                      <a:off x="0" y="0"/>
+                      <a:ext cx="6100589" cy="3315625"/>
+                    </a:xfrm>
+                    <a:prstGeom prst="rect">
+                      <a:avLst/>
+                    </a:prstGeom>
+                  </pic:spPr>
+                </pic:pic>
+              </a:graphicData>
+            </a:graphic>
+          </wp:inline>
+        </w:drawing>
+      </w:r>
+    </w:p>
+    <w:p/>
+    <w:p>
+      <w:r>
+        <w:drawing>
+          <wp:inline distT="0" distB="0" distL="0" distR="0" wp14:anchorId="1B1D41B2" wp14:editId="68AB1FD6">
+            <wp:extent cx="5943600" cy="2237740"/>
+            <wp:effectExtent l="0" t="0" r="0" b="0"/>
+            <wp:docPr id="234997491" name="Picture 1"/>
+            <wp:cNvGraphicFramePr>
+              <a:graphicFrameLocks xmlns:a="http://schemas.openxmlformats.org/drawingml/2006/main" noChangeAspect="1"/>
+            </wp:cNvGraphicFramePr>
+            <a:graphic xmlns:a="http://schemas.openxmlformats.org/drawingml/2006/main">
+              <a:graphicData uri="http://schemas.openxmlformats.org/drawingml/2006/picture">
+                <pic:pic xmlns:pic="http://schemas.openxmlformats.org/drawingml/2006/picture">
+                  <pic:nvPicPr>
+                    <pic:cNvPr id="234997491" name=""/>
+                    <pic:cNvPicPr/>
+                  </pic:nvPicPr>
+                  <pic:blipFill>
+                    <a:blip r:embed="rId20"/>
+                    <a:stretch>
+                      <a:fillRect/>
+                    </a:stretch>
+                  </pic:blipFill>
+                  <pic:spPr>
+                    <a:xfrm>
+                      <a:off x="0" y="0"/>
+                      <a:ext cx="5943600" cy="2237740"/>
+                    </a:xfrm>
+                    <a:prstGeom prst="rect">
+                      <a:avLst/>
+                    </a:prstGeom>
+                  </pic:spPr>
+                </pic:pic>
+              </a:graphicData>
+            </a:graphic>
+          </wp:inline>
+        </w:drawing>
+      </w:r>
+    </w:p>
+    <w:p/>
+    <w:p/>
     <w:sectPr>
+      <w:footerReference w:type="default" r:id="rId21"/>
       <w:pgSz w:w="12240" w:h="15840"/>
       <w:pgMar w:top="1440" w:right="1440" w:bottom="1440" w:left="1440" w:header="720" w:footer="720" w:gutter="0"/>
       <w:cols w:space="720"/>
@@ -493,6 +1077,598 @@
     </w:sectPr>
   </w:body>
 </w:document>
+</file>
+
+<file path=word/endnotes.xml><?xml version="1.0" encoding="utf-8"?>
+<w:endnotes xmlns:wpc="http://schemas.microsoft.com/office/word/2010/wordprocessingCanvas" xmlns:cx="http://schemas.microsoft.com/office/drawing/2014/chartex" xmlns:cx1="http://schemas.microsoft.com/office/drawing/2015/9/8/chartex" xmlns:cx2="http://schemas.microsoft.com/office/drawing/2015/10/21/chartex" xmlns:cx3="http://schemas.microsoft.com/office/drawing/2016/5/9/chartex" xmlns:cx4="http://schemas.microsoft.com/office/drawing/2016/5/10/chartex" xmlns:cx5="http://schemas.microsoft.com/office/drawing/2016/5/11/chartex" xmlns:cx6="http://schemas.microsoft.com/office/drawing/2016/5/12/chartex" xmlns:cx7="http://schemas.microsoft.com/office/drawing/2016/5/13/chartex" xmlns:cx8="http://schemas.microsoft.com/office/drawing/2016/5/14/chartex" xmlns:mc="http://schemas.openxmlformats.org/markup-compatibility/2006" xmlns:aink="http://schemas.microsoft.com/office/drawing/2016/ink" xmlns:am3d="http://schemas.microsoft.com/office/drawing/2017/model3d" xmlns:o="urn:schemas-microsoft-com:office:office" xmlns:oel="http://schemas.microsoft.com/office/2019/extlst" xmlns:r="http://schemas.openxmlformats.org/officeDocument/2006/relationships" xmlns:m="http://schemas.openxmlformats.org/officeDocument/2006/math" xmlns:v="urn:schemas-microsoft-com:vml" xmlns:wp14="http://schemas.microsoft.com/office/word/2010/wordprocessingDrawing" xmlns:wp="http://schemas.openxmlformats.org/drawingml/2006/wordprocessingDrawing" xmlns:w10="urn:schemas-microsoft-com:office:word" xmlns:w="http://schemas.openxmlformats.org/wordprocessingml/2006/main" xmlns:w14="http://schemas.microsoft.com/office/word/2010/wordml" xmlns:w15="http://schemas.microsoft.com/office/word/2012/wordml" xmlns:w16cex="http://schemas.microsoft.com/office/word/2018/wordml/cex" xmlns:w16cid="http://schemas.microsoft.com/office/word/2016/wordml/cid" xmlns:w16="http://schemas.microsoft.com/office/word/2018/wordml" xmlns:w16du="http://schemas.microsoft.com/office/word/2023/wordml/word16du" xmlns:w16sdtdh="http://schemas.microsoft.com/office/word/2020/wordml/sdtdatahash" xmlns:w16sdtfl="http://schemas.microsoft.com/office/word/2024/wordml/sdtformatlock" xmlns:w16se="http://schemas.microsoft.com/office/word/2015/wordml/symex" xmlns:wpg="http://schemas.microsoft.com/office/word/2010/wordprocessingGroup" xmlns:wpi="http://schemas.microsoft.com/office/word/2010/wordprocessingInk" xmlns:wne="http://schemas.microsoft.com/office/word/2006/wordml" xmlns:wps="http://schemas.microsoft.com/office/word/2010/wordprocessingShape" mc:Ignorable="w14 w15 w16se w16cid w16 w16cex w16sdtdh w16sdtfl w16du wp14">
+  <w:endnote w:type="separator" w:id="-1">
+    <w:p>
+      <w:pPr>
+        <w:spacing w:after="0" w:line="240" w:lineRule="auto"/>
+      </w:pPr>
+      <w:r>
+        <w:separator/>
+      </w:r>
+    </w:p>
+  </w:endnote>
+  <w:endnote w:type="continuationSeparator" w:id="0">
+    <w:p>
+      <w:pPr>
+        <w:spacing w:after="0" w:line="240" w:lineRule="auto"/>
+      </w:pPr>
+      <w:r>
+        <w:continuationSeparator/>
+      </w:r>
+    </w:p>
+  </w:endnote>
+</w:endnotes>
+</file>
+
+<file path=word/footer1.xml><?xml version="1.0" encoding="utf-8"?>
+<w:ftr xmlns:wpc="http://schemas.microsoft.com/office/word/2010/wordprocessingCanvas" xmlns:cx="http://schemas.microsoft.com/office/drawing/2014/chartex" xmlns:cx1="http://schemas.microsoft.com/office/drawing/2015/9/8/chartex" xmlns:cx2="http://schemas.microsoft.com/office/drawing/2015/10/21/chartex" xmlns:cx3="http://schemas.microsoft.com/office/drawing/2016/5/9/chartex" xmlns:cx4="http://schemas.microsoft.com/office/drawing/2016/5/10/chartex" xmlns:cx5="http://schemas.microsoft.com/office/drawing/2016/5/11/chartex" xmlns:cx6="http://schemas.microsoft.com/office/drawing/2016/5/12/chartex" xmlns:cx7="http://schemas.microsoft.com/office/drawing/2016/5/13/chartex" xmlns:cx8="http://schemas.microsoft.com/office/drawing/2016/5/14/chartex" xmlns:mc="http://schemas.openxmlformats.org/markup-compatibility/2006" xmlns:aink="http://schemas.microsoft.com/office/drawing/2016/ink" xmlns:am3d="http://schemas.microsoft.com/office/drawing/2017/model3d" xmlns:o="urn:schemas-microsoft-com:office:office" xmlns:oel="http://schemas.microsoft.com/office/2019/extlst" xmlns:r="http://schemas.openxmlformats.org/officeDocument/2006/relationships" xmlns:m="http://schemas.openxmlformats.org/officeDocument/2006/math" xmlns:v="urn:schemas-microsoft-com:vml" xmlns:wp14="http://schemas.microsoft.com/office/word/2010/wordprocessingDrawing" xmlns:wp="http://schemas.openxmlformats.org/drawingml/2006/wordprocessingDrawing" xmlns:w10="urn:schemas-microsoft-com:office:word" xmlns:w="http://schemas.openxmlformats.org/wordprocessingml/2006/main" xmlns:w14="http://schemas.microsoft.com/office/word/2010/wordml" xmlns:w15="http://schemas.microsoft.com/office/word/2012/wordml" xmlns:w16cex="http://schemas.microsoft.com/office/word/2018/wordml/cex" xmlns:w16cid="http://schemas.microsoft.com/office/word/2016/wordml/cid" xmlns:w16="http://schemas.microsoft.com/office/word/2018/wordml" xmlns:w16du="http://schemas.microsoft.com/office/word/2023/wordml/word16du" xmlns:w16sdtdh="http://schemas.microsoft.com/office/word/2020/wordml/sdtdatahash" xmlns:w16sdtfl="http://schemas.microsoft.com/office/word/2024/wordml/sdtformatlock" xmlns:w16se="http://schemas.microsoft.com/office/word/2015/wordml/symex" xmlns:wpg="http://schemas.microsoft.com/office/word/2010/wordprocessingGroup" xmlns:wpi="http://schemas.microsoft.com/office/word/2010/wordprocessingInk" xmlns:wne="http://schemas.microsoft.com/office/word/2006/wordml" xmlns:wps="http://schemas.microsoft.com/office/word/2010/wordprocessingShape" mc:Ignorable="w14 w15 w16se w16cid w16 w16cex w16sdtdh w16sdtfl w16du wp14">
+  <w:sdt>
+    <w:sdtPr>
+      <w:id w:val="1124281831"/>
+      <w:docPartObj>
+        <w:docPartGallery w:val="Page Numbers (Bottom of Page)"/>
+        <w:docPartUnique/>
+      </w:docPartObj>
+    </w:sdtPr>
+    <w:sdtContent>
+      <w:sdt>
+        <w:sdtPr>
+          <w:id w:val="1728636285"/>
+          <w:docPartObj>
+            <w:docPartGallery w:val="Page Numbers (Top of Page)"/>
+            <w:docPartUnique/>
+          </w:docPartObj>
+        </w:sdtPr>
+        <w:sdtContent>
+          <w:p>
+            <w:pPr>
+              <w:pStyle w:val="Footer"/>
+              <w:pBdr>
+                <w:bottom w:val="single" w:sz="6" w:space="1" w:color="auto"/>
+              </w:pBdr>
+              <w:ind w:left="-360" w:firstLine="8280"/>
+              <w:jc w:val="center"/>
+            </w:pPr>
+          </w:p>
+          <w:p>
+            <w:pPr>
+              <w:pStyle w:val="Footer"/>
+              <w:ind w:left="3240" w:firstLine="4680"/>
+              <w:jc w:val="center"/>
+            </w:pPr>
+            <w:r>
+              <w:t xml:space="preserve">Page </w:t>
+            </w:r>
+            <w:r>
+              <w:rPr>
+                <w:b/>
+                <w:bCs/>
+              </w:rPr>
+              <w:fldChar w:fldCharType="begin"/>
+            </w:r>
+            <w:r>
+              <w:rPr>
+                <w:b/>
+                <w:bCs/>
+              </w:rPr>
+              <w:instrText xml:space="preserve"> PAGE </w:instrText>
+            </w:r>
+            <w:r>
+              <w:rPr>
+                <w:b/>
+                <w:bCs/>
+              </w:rPr>
+              <w:fldChar w:fldCharType="separate"/>
+            </w:r>
+            <w:r>
+              <w:rPr>
+                <w:b/>
+                <w:bCs/>
+                <w:noProof/>
+              </w:rPr>
+              <w:t>2</w:t>
+            </w:r>
+            <w:r>
+              <w:rPr>
+                <w:b/>
+                <w:bCs/>
+              </w:rPr>
+              <w:fldChar w:fldCharType="end"/>
+            </w:r>
+            <w:r>
+              <w:t xml:space="preserve"> of </w:t>
+            </w:r>
+            <w:r>
+              <w:rPr>
+                <w:b/>
+                <w:bCs/>
+              </w:rPr>
+              <w:fldChar w:fldCharType="begin"/>
+            </w:r>
+            <w:r>
+              <w:rPr>
+                <w:b/>
+                <w:bCs/>
+              </w:rPr>
+              <w:instrText xml:space="preserve"> NUMPAGES  </w:instrText>
+            </w:r>
+            <w:r>
+              <w:rPr>
+                <w:b/>
+                <w:bCs/>
+              </w:rPr>
+              <w:fldChar w:fldCharType="separate"/>
+            </w:r>
+            <w:r>
+              <w:rPr>
+                <w:b/>
+                <w:bCs/>
+                <w:noProof/>
+              </w:rPr>
+              <w:t>2</w:t>
+            </w:r>
+            <w:r>
+              <w:rPr>
+                <w:b/>
+                <w:bCs/>
+              </w:rPr>
+              <w:fldChar w:fldCharType="end"/>
+            </w:r>
+          </w:p>
+        </w:sdtContent>
+      </w:sdt>
+    </w:sdtContent>
+  </w:sdt>
+  <w:p>
+    <w:pPr>
+      <w:pStyle w:val="Footer"/>
+    </w:pPr>
+  </w:p>
+</w:ftr>
+</file>
+
+<file path=word/footnotes.xml><?xml version="1.0" encoding="utf-8"?>
+<w:footnotes xmlns:wpc="http://schemas.microsoft.com/office/word/2010/wordprocessingCanvas" xmlns:cx="http://schemas.microsoft.com/office/drawing/2014/chartex" xmlns:cx1="http://schemas.microsoft.com/office/drawing/2015/9/8/chartex" xmlns:cx2="http://schemas.microsoft.com/office/drawing/2015/10/21/chartex" xmlns:cx3="http://schemas.microsoft.com/office/drawing/2016/5/9/chartex" xmlns:cx4="http://schemas.microsoft.com/office/drawing/2016/5/10/chartex" xmlns:cx5="http://schemas.microsoft.com/office/drawing/2016/5/11/chartex" xmlns:cx6="http://schemas.microsoft.com/office/drawing/2016/5/12/chartex" xmlns:cx7="http://schemas.microsoft.com/office/drawing/2016/5/13/chartex" xmlns:cx8="http://schemas.microsoft.com/office/drawing/2016/5/14/chartex" xmlns:mc="http://schemas.openxmlformats.org/markup-compatibility/2006" xmlns:aink="http://schemas.microsoft.com/office/drawing/2016/ink" xmlns:am3d="http://schemas.microsoft.com/office/drawing/2017/model3d" xmlns:o="urn:schemas-microsoft-com:office:office" xmlns:oel="http://schemas.microsoft.com/office/2019/extlst" xmlns:r="http://schemas.openxmlformats.org/officeDocument/2006/relationships" xmlns:m="http://schemas.openxmlformats.org/officeDocument/2006/math" xmlns:v="urn:schemas-microsoft-com:vml" xmlns:wp14="http://schemas.microsoft.com/office/word/2010/wordprocessingDrawing" xmlns:wp="http://schemas.openxmlformats.org/drawingml/2006/wordprocessingDrawing" xmlns:w10="urn:schemas-microsoft-com:office:word" xmlns:w="http://schemas.openxmlformats.org/wordprocessingml/2006/main" xmlns:w14="http://schemas.microsoft.com/office/word/2010/wordml" xmlns:w15="http://schemas.microsoft.com/office/word/2012/wordml" xmlns:w16cex="http://schemas.microsoft.com/office/word/2018/wordml/cex" xmlns:w16cid="http://schemas.microsoft.com/office/word/2016/wordml/cid" xmlns:w16="http://schemas.microsoft.com/office/word/2018/wordml" xmlns:w16du="http://schemas.microsoft.com/office/word/2023/wordml/word16du" xmlns:w16sdtdh="http://schemas.microsoft.com/office/word/2020/wordml/sdtdatahash" xmlns:w16sdtfl="http://schemas.microsoft.com/office/word/2024/wordml/sdtformatlock" xmlns:w16se="http://schemas.microsoft.com/office/word/2015/wordml/symex" xmlns:wpg="http://schemas.microsoft.com/office/word/2010/wordprocessingGroup" xmlns:wpi="http://schemas.microsoft.com/office/word/2010/wordprocessingInk" xmlns:wne="http://schemas.microsoft.com/office/word/2006/wordml" xmlns:wps="http://schemas.microsoft.com/office/word/2010/wordprocessingShape" mc:Ignorable="w14 w15 w16se w16cid w16 w16cex w16sdtdh w16sdtfl w16du wp14">
+  <w:footnote w:type="separator" w:id="-1">
+    <w:p>
+      <w:pPr>
+        <w:spacing w:after="0" w:line="240" w:lineRule="auto"/>
+      </w:pPr>
+      <w:r>
+        <w:separator/>
+      </w:r>
+    </w:p>
+  </w:footnote>
+  <w:footnote w:type="continuationSeparator" w:id="0">
+    <w:p>
+      <w:pPr>
+        <w:spacing w:after="0" w:line="240" w:lineRule="auto"/>
+      </w:pPr>
+      <w:r>
+        <w:continuationSeparator/>
+      </w:r>
+    </w:p>
+  </w:footnote>
+</w:footnotes>
+</file>
+
+<file path=word/numbering.xml><?xml version="1.0" encoding="utf-8"?>
+<w:numbering xmlns:wpc="http://schemas.microsoft.com/office/word/2010/wordprocessingCanvas" xmlns:cx="http://schemas.microsoft.com/office/drawing/2014/chartex" xmlns:cx1="http://schemas.microsoft.com/office/drawing/2015/9/8/chartex" xmlns:cx2="http://schemas.microsoft.com/office/drawing/2015/10/21/chartex" xmlns:cx3="http://schemas.microsoft.com/office/drawing/2016/5/9/chartex" xmlns:cx4="http://schemas.microsoft.com/office/drawing/2016/5/10/chartex" xmlns:cx5="http://schemas.microsoft.com/office/drawing/2016/5/11/chartex" xmlns:cx6="http://schemas.microsoft.com/office/drawing/2016/5/12/chartex" xmlns:cx7="http://schemas.microsoft.com/office/drawing/2016/5/13/chartex" xmlns:cx8="http://schemas.microsoft.com/office/drawing/2016/5/14/chartex" xmlns:mc="http://schemas.openxmlformats.org/markup-compatibility/2006" xmlns:aink="http://schemas.microsoft.com/office/drawing/2016/ink" xmlns:am3d="http://schemas.microsoft.com/office/drawing/2017/model3d" xmlns:o="urn:schemas-microsoft-com:office:office" xmlns:oel="http://schemas.microsoft.com/office/2019/extlst" xmlns:r="http://schemas.openxmlformats.org/officeDocument/2006/relationships" xmlns:m="http://schemas.openxmlformats.org/officeDocument/2006/math" xmlns:v="urn:schemas-microsoft-com:vml" xmlns:wp14="http://schemas.microsoft.com/office/word/2010/wordprocessingDrawing" xmlns:wp="http://schemas.openxmlformats.org/drawingml/2006/wordprocessingDrawing" xmlns:w10="urn:schemas-microsoft-com:office:word" xmlns:w="http://schemas.openxmlformats.org/wordprocessingml/2006/main" xmlns:w14="http://schemas.microsoft.com/office/word/2010/wordml" xmlns:w15="http://schemas.microsoft.com/office/word/2012/wordml" xmlns:w16cex="http://schemas.microsoft.com/office/word/2018/wordml/cex" xmlns:w16cid="http://schemas.microsoft.com/office/word/2016/wordml/cid" xmlns:w16="http://schemas.microsoft.com/office/word/2018/wordml" xmlns:w16du="http://schemas.microsoft.com/office/word/2023/wordml/word16du" xmlns:w16sdtdh="http://schemas.microsoft.com/office/word/2020/wordml/sdtdatahash" xmlns:w16sdtfl="http://schemas.microsoft.com/office/word/2024/wordml/sdtformatlock" xmlns:w16se="http://schemas.microsoft.com/office/word/2015/wordml/symex" xmlns:wpg="http://schemas.microsoft.com/office/word/2010/wordprocessingGroup" xmlns:wpi="http://schemas.microsoft.com/office/word/2010/wordprocessingInk" xmlns:wne="http://schemas.microsoft.com/office/word/2006/wordml" xmlns:wps="http://schemas.microsoft.com/office/word/2010/wordprocessingShape" mc:Ignorable="w14 w15 w16se w16cid w16 w16cex w16sdtdh w16sdtfl w16du wp14">
+  <w:abstractNum w:abstractNumId="0" w15:restartNumberingAfterBreak="0">
+    <w:nsid w:val="52A842B2"/>
+    <w:multiLevelType w:val="multilevel"/>
+    <w:tmpl w:val="0409001F"/>
+    <w:lvl w:ilvl="0">
+      <w:start w:val="1"/>
+      <w:numFmt w:val="decimal"/>
+      <w:lvlText w:val="%1."/>
+      <w:lvlJc w:val="left"/>
+      <w:pPr>
+        <w:ind w:left="360" w:hanging="360"/>
+      </w:pPr>
+    </w:lvl>
+    <w:lvl w:ilvl="1">
+      <w:start w:val="1"/>
+      <w:numFmt w:val="decimal"/>
+      <w:lvlText w:val="%1.%2."/>
+      <w:lvlJc w:val="left"/>
+      <w:pPr>
+        <w:ind w:left="792" w:hanging="432"/>
+      </w:pPr>
+    </w:lvl>
+    <w:lvl w:ilvl="2">
+      <w:start w:val="1"/>
+      <w:numFmt w:val="decimal"/>
+      <w:lvlText w:val="%1.%2.%3."/>
+      <w:lvlJc w:val="left"/>
+      <w:pPr>
+        <w:ind w:left="1224" w:hanging="504"/>
+      </w:pPr>
+    </w:lvl>
+    <w:lvl w:ilvl="3">
+      <w:start w:val="1"/>
+      <w:numFmt w:val="decimal"/>
+      <w:lvlText w:val="%1.%2.%3.%4."/>
+      <w:lvlJc w:val="left"/>
+      <w:pPr>
+        <w:ind w:left="1728" w:hanging="648"/>
+      </w:pPr>
+    </w:lvl>
+    <w:lvl w:ilvl="4">
+      <w:start w:val="1"/>
+      <w:numFmt w:val="decimal"/>
+      <w:lvlText w:val="%1.%2.%3.%4.%5."/>
+      <w:lvlJc w:val="left"/>
+      <w:pPr>
+        <w:ind w:left="2232" w:hanging="792"/>
+      </w:pPr>
+    </w:lvl>
+    <w:lvl w:ilvl="5">
+      <w:start w:val="1"/>
+      <w:numFmt w:val="decimal"/>
+      <w:lvlText w:val="%1.%2.%3.%4.%5.%6."/>
+      <w:lvlJc w:val="left"/>
+      <w:pPr>
+        <w:ind w:left="2736" w:hanging="936"/>
+      </w:pPr>
+    </w:lvl>
+    <w:lvl w:ilvl="6">
+      <w:start w:val="1"/>
+      <w:numFmt w:val="decimal"/>
+      <w:lvlText w:val="%1.%2.%3.%4.%5.%6.%7."/>
+      <w:lvlJc w:val="left"/>
+      <w:pPr>
+        <w:ind w:left="3240" w:hanging="1080"/>
+      </w:pPr>
+    </w:lvl>
+    <w:lvl w:ilvl="7">
+      <w:start w:val="1"/>
+      <w:numFmt w:val="decimal"/>
+      <w:lvlText w:val="%1.%2.%3.%4.%5.%6.%7.%8."/>
+      <w:lvlJc w:val="left"/>
+      <w:pPr>
+        <w:ind w:left="3744" w:hanging="1224"/>
+      </w:pPr>
+    </w:lvl>
+    <w:lvl w:ilvl="8">
+      <w:start w:val="1"/>
+      <w:numFmt w:val="decimal"/>
+      <w:lvlText w:val="%1.%2.%3.%4.%5.%6.%7.%8.%9."/>
+      <w:lvlJc w:val="left"/>
+      <w:pPr>
+        <w:ind w:left="4320" w:hanging="1440"/>
+      </w:pPr>
+    </w:lvl>
+  </w:abstractNum>
+  <w:abstractNum w:abstractNumId="1" w15:restartNumberingAfterBreak="0">
+    <w:nsid w:val="679C0C06"/>
+    <w:multiLevelType w:val="hybridMultilevel"/>
+    <w:tmpl w:val="06CABC02"/>
+    <w:lvl w:ilvl="0" w:tplc="04090001">
+      <w:start w:val="1"/>
+      <w:numFmt w:val="bullet"/>
+      <w:lvlText w:val=""/>
+      <w:lvlJc w:val="left"/>
+      <w:pPr>
+        <w:ind w:left="360" w:hanging="360"/>
+      </w:pPr>
+      <w:rPr>
+        <w:rFonts w:ascii="Symbol" w:hAnsi="Symbol" w:hint="default"/>
+      </w:rPr>
+    </w:lvl>
+    <w:lvl w:ilvl="1" w:tplc="04090003" w:tentative="1">
+      <w:start w:val="1"/>
+      <w:numFmt w:val="bullet"/>
+      <w:lvlText w:val="o"/>
+      <w:lvlJc w:val="left"/>
+      <w:pPr>
+        <w:ind w:left="1080" w:hanging="360"/>
+      </w:pPr>
+      <w:rPr>
+        <w:rFonts w:ascii="Courier New" w:hAnsi="Courier New" w:cs="Courier New" w:hint="default"/>
+      </w:rPr>
+    </w:lvl>
+    <w:lvl w:ilvl="2" w:tplc="04090005" w:tentative="1">
+      <w:start w:val="1"/>
+      <w:numFmt w:val="bullet"/>
+      <w:lvlText w:val=""/>
+      <w:lvlJc w:val="left"/>
+      <w:pPr>
+        <w:ind w:left="1800" w:hanging="360"/>
+      </w:pPr>
+      <w:rPr>
+        <w:rFonts w:ascii="Wingdings" w:hAnsi="Wingdings" w:hint="default"/>
+      </w:rPr>
+    </w:lvl>
+    <w:lvl w:ilvl="3" w:tplc="04090001" w:tentative="1">
+      <w:start w:val="1"/>
+      <w:numFmt w:val="bullet"/>
+      <w:lvlText w:val=""/>
+      <w:lvlJc w:val="left"/>
+      <w:pPr>
+        <w:ind w:left="2520" w:hanging="360"/>
+      </w:pPr>
+      <w:rPr>
+        <w:rFonts w:ascii="Symbol" w:hAnsi="Symbol" w:hint="default"/>
+      </w:rPr>
+    </w:lvl>
+    <w:lvl w:ilvl="4" w:tplc="04090003" w:tentative="1">
+      <w:start w:val="1"/>
+      <w:numFmt w:val="bullet"/>
+      <w:lvlText w:val="o"/>
+      <w:lvlJc w:val="left"/>
+      <w:pPr>
+        <w:ind w:left="3240" w:hanging="360"/>
+      </w:pPr>
+      <w:rPr>
+        <w:rFonts w:ascii="Courier New" w:hAnsi="Courier New" w:cs="Courier New" w:hint="default"/>
+      </w:rPr>
+    </w:lvl>
+    <w:lvl w:ilvl="5" w:tplc="04090005" w:tentative="1">
+      <w:start w:val="1"/>
+      <w:numFmt w:val="bullet"/>
+      <w:lvlText w:val=""/>
+      <w:lvlJc w:val="left"/>
+      <w:pPr>
+        <w:ind w:left="3960" w:hanging="360"/>
+      </w:pPr>
+      <w:rPr>
+        <w:rFonts w:ascii="Wingdings" w:hAnsi="Wingdings" w:hint="default"/>
+      </w:rPr>
+    </w:lvl>
+    <w:lvl w:ilvl="6" w:tplc="04090001" w:tentative="1">
+      <w:start w:val="1"/>
+      <w:numFmt w:val="bullet"/>
+      <w:lvlText w:val=""/>
+      <w:lvlJc w:val="left"/>
+      <w:pPr>
+        <w:ind w:left="4680" w:hanging="360"/>
+      </w:pPr>
+      <w:rPr>
+        <w:rFonts w:ascii="Symbol" w:hAnsi="Symbol" w:hint="default"/>
+      </w:rPr>
+    </w:lvl>
+    <w:lvl w:ilvl="7" w:tplc="04090003" w:tentative="1">
+      <w:start w:val="1"/>
+      <w:numFmt w:val="bullet"/>
+      <w:lvlText w:val="o"/>
+      <w:lvlJc w:val="left"/>
+      <w:pPr>
+        <w:ind w:left="5400" w:hanging="360"/>
+      </w:pPr>
+      <w:rPr>
+        <w:rFonts w:ascii="Courier New" w:hAnsi="Courier New" w:cs="Courier New" w:hint="default"/>
+      </w:rPr>
+    </w:lvl>
+    <w:lvl w:ilvl="8" w:tplc="04090005" w:tentative="1">
+      <w:start w:val="1"/>
+      <w:numFmt w:val="bullet"/>
+      <w:lvlText w:val=""/>
+      <w:lvlJc w:val="left"/>
+      <w:pPr>
+        <w:ind w:left="6120" w:hanging="360"/>
+      </w:pPr>
+      <w:rPr>
+        <w:rFonts w:ascii="Wingdings" w:hAnsi="Wingdings" w:hint="default"/>
+      </w:rPr>
+    </w:lvl>
+  </w:abstractNum>
+  <w:abstractNum w:abstractNumId="2" w15:restartNumberingAfterBreak="0">
+    <w:nsid w:val="68A53EB8"/>
+    <w:multiLevelType w:val="hybridMultilevel"/>
+    <w:tmpl w:val="C23E5768"/>
+    <w:lvl w:ilvl="0" w:tplc="04090001">
+      <w:start w:val="1"/>
+      <w:numFmt w:val="bullet"/>
+      <w:lvlText w:val=""/>
+      <w:lvlJc w:val="left"/>
+      <w:pPr>
+        <w:ind w:left="360" w:hanging="360"/>
+      </w:pPr>
+      <w:rPr>
+        <w:rFonts w:ascii="Symbol" w:hAnsi="Symbol" w:hint="default"/>
+      </w:rPr>
+    </w:lvl>
+    <w:lvl w:ilvl="1" w:tplc="04090003" w:tentative="1">
+      <w:start w:val="1"/>
+      <w:numFmt w:val="bullet"/>
+      <w:lvlText w:val="o"/>
+      <w:lvlJc w:val="left"/>
+      <w:pPr>
+        <w:ind w:left="1080" w:hanging="360"/>
+      </w:pPr>
+      <w:rPr>
+        <w:rFonts w:ascii="Courier New" w:hAnsi="Courier New" w:cs="Courier New" w:hint="default"/>
+      </w:rPr>
+    </w:lvl>
+    <w:lvl w:ilvl="2" w:tplc="04090005" w:tentative="1">
+      <w:start w:val="1"/>
+      <w:numFmt w:val="bullet"/>
+      <w:lvlText w:val=""/>
+      <w:lvlJc w:val="left"/>
+      <w:pPr>
+        <w:ind w:left="1800" w:hanging="360"/>
+      </w:pPr>
+      <w:rPr>
+        <w:rFonts w:ascii="Wingdings" w:hAnsi="Wingdings" w:hint="default"/>
+      </w:rPr>
+    </w:lvl>
+    <w:lvl w:ilvl="3" w:tplc="04090001" w:tentative="1">
+      <w:start w:val="1"/>
+      <w:numFmt w:val="bullet"/>
+      <w:lvlText w:val=""/>
+      <w:lvlJc w:val="left"/>
+      <w:pPr>
+        <w:ind w:left="2520" w:hanging="360"/>
+      </w:pPr>
+      <w:rPr>
+        <w:rFonts w:ascii="Symbol" w:hAnsi="Symbol" w:hint="default"/>
+      </w:rPr>
+    </w:lvl>
+    <w:lvl w:ilvl="4" w:tplc="04090003" w:tentative="1">
+      <w:start w:val="1"/>
+      <w:numFmt w:val="bullet"/>
+      <w:lvlText w:val="o"/>
+      <w:lvlJc w:val="left"/>
+      <w:pPr>
+        <w:ind w:left="3240" w:hanging="360"/>
+      </w:pPr>
+      <w:rPr>
+        <w:rFonts w:ascii="Courier New" w:hAnsi="Courier New" w:cs="Courier New" w:hint="default"/>
+      </w:rPr>
+    </w:lvl>
+    <w:lvl w:ilvl="5" w:tplc="04090005" w:tentative="1">
+      <w:start w:val="1"/>
+      <w:numFmt w:val="bullet"/>
+      <w:lvlText w:val=""/>
+      <w:lvlJc w:val="left"/>
+      <w:pPr>
+        <w:ind w:left="3960" w:hanging="360"/>
+      </w:pPr>
+      <w:rPr>
+        <w:rFonts w:ascii="Wingdings" w:hAnsi="Wingdings" w:hint="default"/>
+      </w:rPr>
+    </w:lvl>
+    <w:lvl w:ilvl="6" w:tplc="04090001" w:tentative="1">
+      <w:start w:val="1"/>
+      <w:numFmt w:val="bullet"/>
+      <w:lvlText w:val=""/>
+      <w:lvlJc w:val="left"/>
+      <w:pPr>
+        <w:ind w:left="4680" w:hanging="360"/>
+      </w:pPr>
+      <w:rPr>
+        <w:rFonts w:ascii="Symbol" w:hAnsi="Symbol" w:hint="default"/>
+      </w:rPr>
+    </w:lvl>
+    <w:lvl w:ilvl="7" w:tplc="04090003" w:tentative="1">
+      <w:start w:val="1"/>
+      <w:numFmt w:val="bullet"/>
+      <w:lvlText w:val="o"/>
+      <w:lvlJc w:val="left"/>
+      <w:pPr>
+        <w:ind w:left="5400" w:hanging="360"/>
+      </w:pPr>
+      <w:rPr>
+        <w:rFonts w:ascii="Courier New" w:hAnsi="Courier New" w:cs="Courier New" w:hint="default"/>
+      </w:rPr>
+    </w:lvl>
+    <w:lvl w:ilvl="8" w:tplc="04090005" w:tentative="1">
+      <w:start w:val="1"/>
+      <w:numFmt w:val="bullet"/>
+      <w:lvlText w:val=""/>
+      <w:lvlJc w:val="left"/>
+      <w:pPr>
+        <w:ind w:left="6120" w:hanging="360"/>
+      </w:pPr>
+      <w:rPr>
+        <w:rFonts w:ascii="Wingdings" w:hAnsi="Wingdings" w:hint="default"/>
+      </w:rPr>
+    </w:lvl>
+  </w:abstractNum>
+  <w:abstractNum w:abstractNumId="3" w15:restartNumberingAfterBreak="0">
+    <w:nsid w:val="7E060ACC"/>
+    <w:multiLevelType w:val="hybridMultilevel"/>
+    <w:tmpl w:val="A69C3254"/>
+    <w:lvl w:ilvl="0" w:tplc="0409000F">
+      <w:start w:val="1"/>
+      <w:numFmt w:val="decimal"/>
+      <w:lvlText w:val="%1."/>
+      <w:lvlJc w:val="left"/>
+      <w:pPr>
+        <w:ind w:left="360" w:hanging="360"/>
+      </w:pPr>
+    </w:lvl>
+    <w:lvl w:ilvl="1" w:tplc="04090019" w:tentative="1">
+      <w:start w:val="1"/>
+      <w:numFmt w:val="lowerLetter"/>
+      <w:lvlText w:val="%2."/>
+      <w:lvlJc w:val="left"/>
+      <w:pPr>
+        <w:ind w:left="1080" w:hanging="360"/>
+      </w:pPr>
+    </w:lvl>
+    <w:lvl w:ilvl="2" w:tplc="0409001B" w:tentative="1">
+      <w:start w:val="1"/>
+      <w:numFmt w:val="lowerRoman"/>
+      <w:lvlText w:val="%3."/>
+      <w:lvlJc w:val="right"/>
+      <w:pPr>
+        <w:ind w:left="1800" w:hanging="180"/>
+      </w:pPr>
+    </w:lvl>
+    <w:lvl w:ilvl="3" w:tplc="0409000F" w:tentative="1">
+      <w:start w:val="1"/>
+      <w:numFmt w:val="decimal"/>
+      <w:lvlText w:val="%4."/>
+      <w:lvlJc w:val="left"/>
+      <w:pPr>
+        <w:ind w:left="2520" w:hanging="360"/>
+      </w:pPr>
+    </w:lvl>
+    <w:lvl w:ilvl="4" w:tplc="04090019" w:tentative="1">
+      <w:start w:val="1"/>
+      <w:numFmt w:val="lowerLetter"/>
+      <w:lvlText w:val="%5."/>
+      <w:lvlJc w:val="left"/>
+      <w:pPr>
+        <w:ind w:left="3240" w:hanging="360"/>
+      </w:pPr>
+    </w:lvl>
+    <w:lvl w:ilvl="5" w:tplc="0409001B" w:tentative="1">
+      <w:start w:val="1"/>
+      <w:numFmt w:val="lowerRoman"/>
+      <w:lvlText w:val="%6."/>
+      <w:lvlJc w:val="right"/>
+      <w:pPr>
+        <w:ind w:left="3960" w:hanging="180"/>
+      </w:pPr>
+    </w:lvl>
+    <w:lvl w:ilvl="6" w:tplc="0409000F" w:tentative="1">
+      <w:start w:val="1"/>
+      <w:numFmt w:val="decimal"/>
+      <w:lvlText w:val="%7."/>
+      <w:lvlJc w:val="left"/>
+      <w:pPr>
+        <w:ind w:left="4680" w:hanging="360"/>
+      </w:pPr>
+    </w:lvl>
+    <w:lvl w:ilvl="7" w:tplc="04090019" w:tentative="1">
+      <w:start w:val="1"/>
+      <w:numFmt w:val="lowerLetter"/>
+      <w:lvlText w:val="%8."/>
+      <w:lvlJc w:val="left"/>
+      <w:pPr>
+        <w:ind w:left="5400" w:hanging="360"/>
+      </w:pPr>
+    </w:lvl>
+    <w:lvl w:ilvl="8" w:tplc="0409001B" w:tentative="1">
+      <w:start w:val="1"/>
+      <w:numFmt w:val="lowerRoman"/>
+      <w:lvlText w:val="%9."/>
+      <w:lvlJc w:val="right"/>
+      <w:pPr>
+        <w:ind w:left="6120" w:hanging="180"/>
+      </w:pPr>
+    </w:lvl>
+  </w:abstractNum>
+  <w:num w:numId="1" w16cid:durableId="1638026227">
+    <w:abstractNumId w:val="1"/>
+  </w:num>
+  <w:num w:numId="2" w16cid:durableId="1923442220">
+    <w:abstractNumId w:val="3"/>
+  </w:num>
+  <w:num w:numId="3" w16cid:durableId="127476206">
+    <w:abstractNumId w:val="2"/>
+  </w:num>
+  <w:num w:numId="4" w16cid:durableId="1822694246">
+    <w:abstractNumId w:val="0"/>
+  </w:num>
+</w:numbering>
 </file>
 
 <file path=word/styles.xml><?xml version="1.0" encoding="utf-8"?>
@@ -1434,6 +2610,50 @@
       <w:shd w:val="clear" w:color="auto" w:fill="E1DFDD"/>
     </w:rPr>
   </w:style>
+  <w:style w:type="paragraph" w:styleId="Header">
+    <w:name w:val="header"/>
+    <w:basedOn w:val="Normal"/>
+    <w:link w:val="HeaderChar"/>
+    <w:uiPriority w:val="99"/>
+    <w:unhideWhenUsed/>
+    <w:rsid w:val="00B3691D"/>
+    <w:pPr>
+      <w:tabs>
+        <w:tab w:val="center" w:pos="4680"/>
+        <w:tab w:val="right" w:pos="9360"/>
+      </w:tabs>
+      <w:spacing w:after="0" w:line="240" w:lineRule="auto"/>
+    </w:pPr>
+  </w:style>
+  <w:style w:type="character" w:customStyle="1" w:styleId="HeaderChar">
+    <w:name w:val="Header Char"/>
+    <w:basedOn w:val="DefaultParagraphFont"/>
+    <w:link w:val="Header"/>
+    <w:uiPriority w:val="99"/>
+    <w:rsid w:val="00B3691D"/>
+  </w:style>
+  <w:style w:type="paragraph" w:styleId="Footer">
+    <w:name w:val="footer"/>
+    <w:basedOn w:val="Normal"/>
+    <w:link w:val="FooterChar"/>
+    <w:uiPriority w:val="99"/>
+    <w:unhideWhenUsed/>
+    <w:rsid w:val="00B3691D"/>
+    <w:pPr>
+      <w:tabs>
+        <w:tab w:val="center" w:pos="4680"/>
+        <w:tab w:val="right" w:pos="9360"/>
+      </w:tabs>
+      <w:spacing w:after="0" w:line="240" w:lineRule="auto"/>
+    </w:pPr>
+  </w:style>
+  <w:style w:type="character" w:customStyle="1" w:styleId="FooterChar">
+    <w:name w:val="Footer Char"/>
+    <w:basedOn w:val="DefaultParagraphFont"/>
+    <w:link w:val="Footer"/>
+    <w:uiPriority w:val="99"/>
+    <w:rsid w:val="00B3691D"/>
+  </w:style>
 </w:styles>
 </file>
 

</xml_diff>